<commit_message>
Fill ProstateNET Data Access Request Form with project details
Extracted key information from the project's grant proposals and used `python-docx` to populate `ProstateNET_Data_Access_Request_Form.docx`. The filled information includes PI details, project title, aim, methodology, dataset requirements, expected results, funding information, duration, and ethical considerations. Included the script `fill_docx.py` used to perform the data population.

Co-authored-by: jakubMitura14 <53857487+jakubMitura14@users.noreply.github.com>
</commit_message>
<xml_diff>
--- a/grant_proposal/ProstateNET_Data_Access_Request_Form.docx
+++ b/grant_proposal/ProstateNET_Data_Access_Request_Form.docx
@@ -160,6 +160,11 @@
       </w:r>
     </w:p>
     <w:p>
+      <w:r>
+        <w:t>Jakub Mitura, Joanna Wybrańska.</w:t>
+      </w:r>
+    </w:p>
+    <w:p>
       <w:pPr>
         <w:pStyle w:val="Heading1"/>
         <w:rPr>
@@ -205,6 +210,11 @@
           <w:szCs w:val="24"/>
         </w:rPr>
         <w:t>.</w:t>
+      </w:r>
+    </w:p>
+    <w:p>
+      <w:r>
+        <w:t>Generative AI for Nuclear Medicine Optimization (CausalPCa)</w:t>
       </w:r>
     </w:p>
     <w:p>
@@ -272,6 +282,11 @@
       </w:r>
     </w:p>
     <w:p>
+      <w:r>
+        <w:t>Leverage advanced generative architectures to synthesize high-fidelity medical imagery to enhance diagnostic precision while prioritizing patient safety, and modeling prostate cancer disease evolution with a causal AI framework.</w:t>
+      </w:r>
+    </w:p>
+    <w:p>
       <w:pPr>
         <w:pStyle w:val="Heading1"/>
         <w:rPr>
@@ -334,6 +349,11 @@
       </w:r>
     </w:p>
     <w:p>
+      <w:r>
+        <w:t>The project aims to develop a novel AI framework for managing prostate cancer by moving beyond simple prediction to a deep, causal understanding of disease progression. The goal is to create a transparent decision support tool that can integrate diverse, irregularly sampled clinical data (MRI, PET/CT, SPECT/CT, PSA, notes) and provide explainable insights through counterfactual reasoning. By disentangling the underlying biological signals from technical confounders, the model will simulate disease trajectories and treatment outcomes, mirroring a clinician's own reasoning process and fostering clinical trust.</w:t>
+      </w:r>
+    </w:p>
+    <w:p>
       <w:pPr>
         <w:pStyle w:val="Heading1"/>
         <w:rPr>
@@ -378,6 +398,11 @@
           <w:szCs w:val="24"/>
         </w:rPr>
         <w:t>Outline the study design, and the main methods or algorithms you will apply.</w:t>
+      </w:r>
+    </w:p>
+    <w:p>
+      <w:r>
+        <w:t>Multi-stage causal AI framework, generative models (Diffusion, VAEs, Transformers), Neural Jump ODEs for temporal trajectory modeling. The framework is built upon a sequential, multi-stage training process: Training Foundational Supervisor Models, Per-Modality Causal Representation Learning, Temporal Trajectory Modeling with Neural Jump ODEs, and Generative Synthesis and Clinical Outputs.</w:t>
       </w:r>
     </w:p>
     <w:p>
@@ -426,6 +451,11 @@
       </w:r>
     </w:p>
     <w:p>
+      <w:r>
+        <w:t>~100,000 DICOM/NIfTI files (MRI, PET/CT, SPECT/CT). Dataset: ~300 TB (Raw/Processed). Stored in HDF5 format for efficient parallel I/O. Access to Exascale capabilities is vital for training high-fidelity generative models on this large dataset. Hybrid Julia/Python stack.</w:t>
+      </w:r>
+    </w:p>
+    <w:p>
       <w:pPr>
         <w:pStyle w:val="Heading1"/>
         <w:rPr>
@@ -466,6 +496,11 @@
           <w:szCs w:val="24"/>
         </w:rPr>
         <w:t xml:space="preserve"> the main expected results and their potential applicability in clinical or research practice (maximum 100 words).</w:t>
+      </w:r>
+    </w:p>
+    <w:p>
+      <w:r>
+        <w:t>High-fidelity synthetic image generation, counterfactual disease trajectories, radiation reduction. The AI system is designed as a decision support tool for medical professionals. Final diagnostic and treatment decisions remain with human doctors. The system provides probabilistic outputs and uncertainty estimates to aid, not replace, human judgment.</w:t>
       </w:r>
     </w:p>
     <w:p>
@@ -533,6 +568,11 @@
       </w:r>
     </w:p>
     <w:p>
+      <w:r>
+        <w:t>Public Funding (University/Hospital)</w:t>
+      </w:r>
+    </w:p>
+    <w:p>
       <w:pPr>
         <w:pStyle w:val="Heading1"/>
         <w:rPr>
@@ -563,6 +603,11 @@
           <w:szCs w:val="24"/>
         </w:rPr>
         <w:t>Indicate the planned start and end dates of your project.</w:t>
+      </w:r>
+    </w:p>
+    <w:p>
+      <w:r>
+        <w:t>36 Months (from May 1, 2025 to April 30, 2028).</w:t>
       </w:r>
     </w:p>
     <w:p>
@@ -611,6 +656,11 @@
       </w:r>
     </w:p>
     <w:p>
+      <w:r>
+        <w:t>Strictly synthetic and/or fully anonymized retrospective data, no PII, complies with GDPR and local regulations. Data usage is strictly for research purposes with appropriate ethics committee approval. Data is pseudonymized at source and anonymized for processing. Access is restricted to authorized personnel.</w:t>
+      </w:r>
+    </w:p>
+    <w:p>
       <w:pPr>
         <w:pStyle w:val="Heading1"/>
         <w:rPr>
@@ -655,6 +705,11 @@
           <w:szCs w:val="24"/>
         </w:rPr>
         <w:t>Attach relevant documents, such as ethics approval letters, funding confirmation, or CVs of the research team.</w:t>
+      </w:r>
+    </w:p>
+    <w:p>
+      <w:r>
+        <w:t>PI CV uploaded.</w:t>
       </w:r>
     </w:p>
     <w:p>

</xml_diff>

<commit_message>
Fill ProstateNET Data Access Request Form with generalized project details
Extracted key information from the project's grant proposals and used `python-docx` to populate `ProstateNET_Data_Access_Request_Form.docx`. The filled information includes PI details, project title, aim, methodology, dataset requirements, expected results, funding information, duration, and ethical considerations. Included the script `fill_docx.py` used to perform the data population. The language used to fill the form has been generalized from the proposal text to protect sensitive intellectual property and project-specific methods.

Co-authored-by: jakubMitura14 <53857487+jakubMitura14@users.noreply.github.com>
</commit_message>
<xml_diff>
--- a/grant_proposal/ProstateNET_Data_Access_Request_Form.docx
+++ b/grant_proposal/ProstateNET_Data_Access_Request_Form.docx
@@ -165,6 +165,9 @@
       </w:r>
     </w:p>
     <w:p>
+      <w:r/>
+    </w:p>
+    <w:p>
       <w:pPr>
         <w:pStyle w:val="Heading1"/>
         <w:rPr>
@@ -213,9 +216,15 @@
       </w:r>
     </w:p>
     <w:p>
+      <w:r/>
+    </w:p>
+    <w:p>
       <w:r>
-        <w:t>Generative AI for Nuclear Medicine Optimization (CausalPCa)</w:t>
+        <w:t>AI for Medical Imaging Optimization</w:t>
       </w:r>
+    </w:p>
+    <w:p>
+      <w:r/>
     </w:p>
     <w:p>
       <w:pPr>
@@ -282,9 +291,15 @@
       </w:r>
     </w:p>
     <w:p>
+      <w:r/>
+    </w:p>
+    <w:p>
       <w:r>
-        <w:t>Leverage advanced generative architectures to synthesize high-fidelity medical imagery to enhance diagnostic precision while prioritizing patient safety, and modeling prostate cancer disease evolution with a causal AI framework.</w:t>
+        <w:t>To develop AI tools and models that assist in the analysis and optimization of medical imaging workflows, ultimately enhancing diagnostic precision and supporting clinical decision-making.</w:t>
       </w:r>
+    </w:p>
+    <w:p>
+      <w:r/>
     </w:p>
     <w:p>
       <w:pPr>
@@ -349,9 +364,15 @@
       </w:r>
     </w:p>
     <w:p>
+      <w:r/>
+    </w:p>
+    <w:p>
       <w:r>
-        <w:t>The project aims to develop a novel AI framework for managing prostate cancer by moving beyond simple prediction to a deep, causal understanding of disease progression. The goal is to create a transparent decision support tool that can integrate diverse, irregularly sampled clinical data (MRI, PET/CT, SPECT/CT, PSA, notes) and provide explainable insights through counterfactual reasoning. By disentangling the underlying biological signals from technical confounders, the model will simulate disease trajectories and treatment outcomes, mirroring a clinician's own reasoning process and fostering clinical trust.</w:t>
+        <w:t>Recent advancements in artificial intelligence offer significant opportunities to improve the interpretation and utility of complex medical datasets. This project aims to harness these capabilities to build robust models capable of analyzing multimodal clinical data. By focusing on fundamental representation learning and predictive modeling, we aim to provide actionable insights while ensuring the safety and transparency of the resulting systems.</w:t>
       </w:r>
+    </w:p>
+    <w:p>
+      <w:r/>
     </w:p>
     <w:p>
       <w:pPr>
@@ -401,9 +422,15 @@
       </w:r>
     </w:p>
     <w:p>
+      <w:r/>
+    </w:p>
+    <w:p>
       <w:r>
-        <w:t>Multi-stage causal AI framework, generative models (Diffusion, VAEs, Transformers), Neural Jump ODEs for temporal trajectory modeling. The framework is built upon a sequential, multi-stage training process: Training Foundational Supervisor Models, Per-Modality Causal Representation Learning, Temporal Trajectory Modeling with Neural Jump ODEs, and Generative Synthesis and Clinical Outputs.</w:t>
+        <w:t>We will employ a multi-stage AI framework incorporating deep learning techniques, including representation learning and sequence modeling. The approach involves developing generalized supervisor models and exploring various neural architectures to effectively process and analyze the provided imaging datasets and corresponding clinical information.</w:t>
       </w:r>
+    </w:p>
+    <w:p>
+      <w:r/>
     </w:p>
     <w:p>
       <w:pPr>
@@ -451,9 +478,15 @@
       </w:r>
     </w:p>
     <w:p>
+      <w:r/>
+    </w:p>
+    <w:p>
       <w:r>
-        <w:t>~100,000 DICOM/NIfTI files (MRI, PET/CT, SPECT/CT). Dataset: ~300 TB (Raw/Processed). Stored in HDF5 format for efficient parallel I/O. Access to Exascale capabilities is vital for training high-fidelity generative models on this large dataset. Hybrid Julia/Python stack.</w:t>
+        <w:t>The project requires access to a substantial cohort of retrospective imaging studies (e.g., MRI, PET/CT) and associated clinical data. We anticipate utilizing approximately 100,000 multimodal imaging files, necessitating robust data handling and parallel processing capabilities to train advanced models effectively.</w:t>
       </w:r>
+    </w:p>
+    <w:p>
+      <w:r/>
     </w:p>
     <w:p>
       <w:pPr>
@@ -499,9 +532,15 @@
       </w:r>
     </w:p>
     <w:p>
+      <w:r/>
+    </w:p>
+    <w:p>
       <w:r>
-        <w:t>High-fidelity synthetic image generation, counterfactual disease trajectories, radiation reduction. The AI system is designed as a decision support tool for medical professionals. Final diagnostic and treatment decisions remain with human doctors. The system provides probabilistic outputs and uncertainty estimates to aid, not replace, human judgment.</w:t>
+        <w:t>We expect to develop enhanced computational models capable of supporting diagnostic processes and offering quantitative insights into disease progression. The primary application is to serve as a decision-support mechanism for clinicians, providing probabilistic assessments to aid—but not replace—expert medical judgment.</w:t>
       </w:r>
+    </w:p>
+    <w:p>
+      <w:r/>
     </w:p>
     <w:p>
       <w:pPr>
@@ -573,6 +612,9 @@
       </w:r>
     </w:p>
     <w:p>
+      <w:r/>
+    </w:p>
+    <w:p>
       <w:pPr>
         <w:pStyle w:val="Heading1"/>
         <w:rPr>
@@ -609,6 +651,9 @@
       <w:r>
         <w:t>36 Months (from May 1, 2025 to April 30, 2028).</w:t>
       </w:r>
+    </w:p>
+    <w:p>
+      <w:r/>
     </w:p>
     <w:p>
       <w:pPr>
@@ -656,9 +701,15 @@
       </w:r>
     </w:p>
     <w:p>
+      <w:r/>
+    </w:p>
+    <w:p>
       <w:r>
-        <w:t>Strictly synthetic and/or fully anonymized retrospective data, no PII, complies with GDPR and local regulations. Data usage is strictly for research purposes with appropriate ethics committee approval. Data is pseudonymized at source and anonymized for processing. Access is restricted to authorized personnel.</w:t>
+        <w:t>All research will be conducted using fully anonymized retrospective data, ensuring no personally identifiable information (PII) is accessed or processed. The study complies fully with GDPR requirements and relevant local regulations. Ethical approvals will be secured prior to any data processing.</w:t>
       </w:r>
+    </w:p>
+    <w:p>
+      <w:r/>
     </w:p>
     <w:p>
       <w:pPr>
@@ -711,6 +762,9 @@
       <w:r>
         <w:t>PI CV uploaded.</w:t>
       </w:r>
+    </w:p>
+    <w:p>
+      <w:r/>
     </w:p>
     <w:p>
       <w:pPr>

</xml_diff>

<commit_message>
Request entire ProstateNET dataset with robust justification
Updated `fill_docx.py` to specifically state the requirement for the complete ProstateNET dataset (>17,000 cases, >1.5 million images). Included generic but strong rationale explaining that access to a massive and highly heterogeneous dataset is strictly necessary for training robust, vendor-agnostic foundation models and ensuring broad generalizability. Regenerated `ProstateNET_Data_Access_Request_Form.docx` with these updates.

Co-authored-by: jakubMitura14 <53857487+jakubMitura14@users.noreply.github.com>
</commit_message>
<xml_diff>
--- a/grant_proposal/ProstateNET_Data_Access_Request_Form.docx
+++ b/grant_proposal/ProstateNET_Data_Access_Request_Form.docx
@@ -478,12 +478,15 @@
       </w:r>
     </w:p>
     <w:p>
+      <w:r>
+        <w:t>The project requires access to the entirety of the ProstateNET dataset, encompassing all available &gt;17,000 cases and &gt;1.5 million image representations, along with associated clinical and annotated data. Access to this complete, highly heterogeneous dataset across different vendors and clinical sites is vital. Training robust, vendor-agnostic foundation models and ensuring broad generalizability requires the maximum possible volume and diversity of data, making a partial subset insufficient for overcoming the current challenges in model generalizability.</w:t>
+      </w:r>
+    </w:p>
+    <w:p>
       <w:r/>
     </w:p>
     <w:p>
-      <w:r>
-        <w:t>The project requires access to a substantial cohort of retrospective imaging studies (e.g., MRI, PET/CT) and associated clinical data. We anticipate utilizing approximately 100,000 multimodal imaging files, necessitating robust data handling and parallel processing capabilities to train advanced models effectively.</w:t>
-      </w:r>
+      <w:r/>
     </w:p>
     <w:p>
       <w:r/>

</xml_diff>